<commit_message>
docs: rebrand to All Is Well and generate PDFs for all 4 documents
- Replaced "Transparency Portal" with "All Is Well" across all documents
- Added tagline "Your End-to-End Digital Health Dashboard" at key mentions
- Generated PDF versions of all 4 documents

Co-Authored-By: Claude Opus 4.6 <noreply@anthropic.com>
</commit_message>
<xml_diff>
--- a/docs/articles/transparency-portal-project-description.docx
+++ b/docs/articles/transparency-portal-project-description.docx
@@ -7,7 +7,7 @@
         <w:pStyle w:val="Title"/>
       </w:pPr>
       <w:r>
-        <w:t xml:space="preserve">Transparency Portal — Project Description</w:t>
+        <w:t>All Is Well — Project Description</w:t>
       </w:r>
     </w:p>
     <w:p>
@@ -23,7 +23,7 @@
           <w:sz w:val="22"/>
           <w:szCs w:val="22"/>
         </w:rPr>
-        <w:t xml:space="preserve">AI-Powered Infrastructure Transparency for Managed Service Providers</w:t>
+        <w:t>AI-Powered Infrastructure Transparency for Managed Service Providers — Your End-to-End Digital Health Dashboard</w:t>
       </w:r>
     </w:p>
     <w:p>
@@ -60,7 +60,7 @@
         <w:spacing w:after="120"/>
       </w:pPr>
       <w:r>
-        <w:t xml:space="preserve">The Transparency Portal is a real-time, AI-powered dashboard that gives MSP customers complete visibility into their managed infrastructure. Built with Next.js and powered by </w:t>
+        <w:t xml:space="preserve">All Is Well is a real-time, AI-powered dashboard that gives MSP customers complete visibility into their managed infrastructure. Built with Next.js and powered by </w:t>
       </w:r>
       <w:r>
         <w:rPr>

</xml_diff>